<commit_message>
docs: remove Help & Support, embed screenshots directly into Word document
</commit_message>
<xml_diff>
--- a/artifacts/project_submission_document.docx
+++ b/artifacts/project_submission_document.docx
@@ -1276,7 +1276,190 @@
           <w:color w:val="333333"/>
           <w:sz w:val="22"/>
         </w:rPr>
-        <w:t>Refer to the live application at https://bng1.vercel.app to view the active generator dashboard, interactive chips, and checkmark validation flows.</w:t>
+        <w:t>The following screenshots showcase the interface and validation functionality of the BrandGen web application:</w:t>
+      </w:r>
+    </w:p>
+    <w:p>
+      <w:pPr>
+        <w:spacing w:after="40" w:line="276" w:lineRule="auto"/>
+      </w:pPr>
+      <w:r>
+        <w:rPr>
+          <w:rFonts w:ascii="Calibri" w:hAnsi="Calibri"/>
+          <w:b/>
+          <w:i w:val="0"/>
+          <w:color w:val="333333"/>
+          <w:sz w:val="22"/>
+        </w:rPr>
+        <w:t>Figure 1: BrandGen Generator Form (Landing Page)</w:t>
+      </w:r>
+    </w:p>
+    <w:p>
+      <w:r>
+        <w:drawing>
+          <wp:inline xmlns:a="http://schemas.openxmlformats.org/drawingml/2006/main" xmlns:pic="http://schemas.openxmlformats.org/drawingml/2006/picture">
+            <wp:extent cx="5029200" cy="2475309"/>
+            <wp:docPr id="1" name="Picture 1"/>
+            <wp:cNvGraphicFramePr>
+              <a:graphicFrameLocks noChangeAspect="1"/>
+            </wp:cNvGraphicFramePr>
+            <a:graphic>
+              <a:graphicData uri="http://schemas.openxmlformats.org/drawingml/2006/picture">
+                <pic:pic>
+                  <pic:nvPicPr>
+                    <pic:cNvPr id="0" name="landing_page_1785315823000.png"/>
+                    <pic:cNvPicPr/>
+                  </pic:nvPicPr>
+                  <pic:blipFill>
+                    <a:blip r:embed="rId9"/>
+                    <a:stretch>
+                      <a:fillRect/>
+                    </a:stretch>
+                  </pic:blipFill>
+                  <pic:spPr>
+                    <a:xfrm>
+                      <a:off x="0" y="0"/>
+                      <a:ext cx="5029200" cy="2475309"/>
+                    </a:xfrm>
+                    <a:prstGeom prst="rect"/>
+                  </pic:spPr>
+                </pic:pic>
+              </a:graphicData>
+            </a:graphic>
+          </wp:inline>
+        </w:drawing>
+      </w:r>
+    </w:p>
+    <w:p>
+      <w:pPr>
+        <w:spacing w:after="240"/>
+      </w:pPr>
+    </w:p>
+    <w:p>
+      <w:pPr>
+        <w:spacing w:after="40" w:line="276" w:lineRule="auto"/>
+      </w:pPr>
+      <w:r>
+        <w:rPr>
+          <w:rFonts w:ascii="Calibri" w:hAnsi="Calibri"/>
+          <w:b/>
+          <w:i w:val="0"/>
+          <w:color w:val="333333"/>
+          <w:sz w:val="22"/>
+        </w:rPr>
+        <w:t>Figure 2: Generated Brand Name Candidates Grid (18 Suggestions in 80/20 Mix)</w:t>
+      </w:r>
+    </w:p>
+    <w:p>
+      <w:r>
+        <w:drawing>
+          <wp:inline xmlns:a="http://schemas.openxmlformats.org/drawingml/2006/main" xmlns:pic="http://schemas.openxmlformats.org/drawingml/2006/picture">
+            <wp:extent cx="5029200" cy="2475309"/>
+            <wp:docPr id="2" name="Picture 2"/>
+            <wp:cNvGraphicFramePr>
+              <a:graphicFrameLocks noChangeAspect="1"/>
+            </wp:cNvGraphicFramePr>
+            <a:graphic>
+              <a:graphicData uri="http://schemas.openxmlformats.org/drawingml/2006/picture">
+                <pic:pic>
+                  <pic:nvPicPr>
+                    <pic:cNvPr id="0" name="generated_brands_1785315883929.png"/>
+                    <pic:cNvPicPr/>
+                  </pic:nvPicPr>
+                  <pic:blipFill>
+                    <a:blip r:embed="rId10"/>
+                    <a:stretch>
+                      <a:fillRect/>
+                    </a:stretch>
+                  </pic:blipFill>
+                  <pic:spPr>
+                    <a:xfrm>
+                      <a:off x="0" y="0"/>
+                      <a:ext cx="5029200" cy="2475309"/>
+                    </a:xfrm>
+                    <a:prstGeom prst="rect"/>
+                  </pic:spPr>
+                </pic:pic>
+              </a:graphicData>
+            </a:graphic>
+          </wp:inline>
+        </w:drawing>
+      </w:r>
+    </w:p>
+    <w:p>
+      <w:pPr>
+        <w:spacing w:after="240"/>
+      </w:pPr>
+    </w:p>
+    <w:p>
+      <w:pPr>
+        <w:spacing w:after="40" w:line="276" w:lineRule="auto"/>
+      </w:pPr>
+      <w:r>
+        <w:rPr>
+          <w:rFonts w:ascii="Calibri" w:hAnsi="Calibri"/>
+          <w:b/>
+          <w:i w:val="0"/>
+          <w:color w:val="333333"/>
+          <w:sz w:val="22"/>
+        </w:rPr>
+        <w:t>Figure 3: Multi-Channel Availability Validation Panel for Chosen Brand</w:t>
+      </w:r>
+    </w:p>
+    <w:p>
+      <w:r>
+        <w:drawing>
+          <wp:inline xmlns:a="http://schemas.openxmlformats.org/drawingml/2006/main" xmlns:pic="http://schemas.openxmlformats.org/drawingml/2006/picture">
+            <wp:extent cx="5029200" cy="2475309"/>
+            <wp:docPr id="3" name="Picture 3"/>
+            <wp:cNvGraphicFramePr>
+              <a:graphicFrameLocks noChangeAspect="1"/>
+            </wp:cNvGraphicFramePr>
+            <a:graphic>
+              <a:graphicData uri="http://schemas.openxmlformats.org/drawingml/2006/picture">
+                <pic:pic>
+                  <pic:nvPicPr>
+                    <pic:cNvPr id="0" name="brand_details_1785315903388.png"/>
+                    <pic:cNvPicPr/>
+                  </pic:nvPicPr>
+                  <pic:blipFill>
+                    <a:blip r:embed="rId11"/>
+                    <a:stretch>
+                      <a:fillRect/>
+                    </a:stretch>
+                  </pic:blipFill>
+                  <pic:spPr>
+                    <a:xfrm>
+                      <a:off x="0" y="0"/>
+                      <a:ext cx="5029200" cy="2475309"/>
+                    </a:xfrm>
+                    <a:prstGeom prst="rect"/>
+                  </pic:spPr>
+                </pic:pic>
+              </a:graphicData>
+            </a:graphic>
+          </wp:inline>
+        </w:drawing>
+      </w:r>
+    </w:p>
+    <w:p>
+      <w:pPr>
+        <w:spacing w:after="240"/>
+      </w:pPr>
+    </w:p>
+    <w:p>
+      <w:pPr>
+        <w:spacing w:after="120" w:line="276" w:lineRule="auto"/>
+      </w:pPr>
+      <w:r>
+        <w:rPr>
+          <w:rFonts w:ascii="Calibri" w:hAnsi="Calibri"/>
+          <w:b w:val="0"/>
+          <w:i w:val="0"/>
+          <w:color w:val="333333"/>
+          <w:sz w:val="22"/>
+        </w:rPr>
+        <w:t>Walkthrough Video: The complete user flow is recorded in the 'brandgen_demo_flow_*.webp' video file included in the project directory.</w:t>
       </w:r>
     </w:p>
     <w:p>

</xml_diff>